<commit_message>
Uploaded level 0.5 part 3 refined and level 0.6
</commit_message>
<xml_diff>
--- a/STM32/Level 0/Level 0.5 Part 3 (0.5.6 STM32CubeIDE).docx
+++ b/STM32/Level 0/Level 0.5 Part 3 (0.5.6 STM32CubeIDE).docx
@@ -89,6 +89,88 @@
         </w:rPr>
         <w:br/>
         <w:t>This is the total 0.5.6</w:t>
+      </w:r>
+      <w:r>
+        <w:rPr>
+          <w:sz w:val="18"/>
+          <w:szCs w:val="18"/>
+          <w:lang w:val="en-US"/>
+        </w:rPr>
+        <w:br/>
+      </w:r>
+      <w:r>
+        <w:rPr>
+          <w:sz w:val="18"/>
+          <w:szCs w:val="18"/>
+          <w:lang w:val="en-US"/>
+        </w:rPr>
+        <w:br/>
+      </w:r>
+      <w:r>
+        <w:rPr>
+          <w:sz w:val="18"/>
+          <w:szCs w:val="18"/>
+          <w:lang w:val="en-US"/>
+        </w:rPr>
+        <w:br/>
+      </w:r>
+      <w:r>
+        <w:rPr>
+          <w:sz w:val="18"/>
+          <w:szCs w:val="18"/>
+          <w:lang w:val="en-US"/>
+        </w:rPr>
+        <w:br/>
+      </w:r>
+      <w:r>
+        <w:rPr>
+          <w:sz w:val="18"/>
+          <w:szCs w:val="18"/>
+          <w:lang w:val="en-US"/>
+        </w:rPr>
+        <w:br/>
+      </w:r>
+      <w:r>
+        <w:rPr>
+          <w:sz w:val="18"/>
+          <w:szCs w:val="18"/>
+          <w:lang w:val="en-US"/>
+        </w:rPr>
+        <w:br/>
+      </w:r>
+      <w:r>
+        <w:rPr>
+          <w:sz w:val="18"/>
+          <w:szCs w:val="18"/>
+          <w:lang w:val="en-US"/>
+        </w:rPr>
+        <w:br/>
+      </w:r>
+      <w:r>
+        <w:rPr>
+          <w:sz w:val="18"/>
+          <w:szCs w:val="18"/>
+          <w:lang w:val="en-US"/>
+        </w:rPr>
+        <w:br/>
+        <w:t>I also want us to practice with proteus 8 professional software, but after first program the software itself was crashed so I’m skipping this part and want to move forward.</w:t>
+      </w:r>
+      <w:r>
+        <w:rPr>
+          <w:sz w:val="18"/>
+          <w:szCs w:val="18"/>
+          <w:lang w:val="en-US"/>
+        </w:rPr>
+        <w:br/>
+      </w:r>
+      <w:r>
+        <w:rPr>
+          <w:sz w:val="18"/>
+          <w:szCs w:val="18"/>
+          <w:lang w:val="en-US"/>
+        </w:rPr>
+        <w:br/>
+        <w:t xml:space="preserve">I’ve almost spent 2hr 30min solving it, but no luck this time so I’m looking forward to buy a board itself for practice.  </w:t>
       </w:r>
     </w:p>
     <w:sectPr>

</xml_diff>